<commit_message>
Adjust Study 1 figure size
</commit_message>
<xml_diff>
--- a/CV.docx
+++ b/CV.docx
@@ -907,7 +907,6 @@
         </w:rPr>
       </w:pPr>
       <w:proofErr w:type="spellStart"/>
-      <w:proofErr w:type="gramStart"/>
       <w:r>
         <w:rPr>
           <w:rFonts w:ascii="Times New Roman" w:hAnsi="Times New Roman" w:cs="Times New Roman" w:hint="eastAsia"/>
@@ -920,7 +919,6 @@
         <w:t>S.Shin</w:t>
       </w:r>
       <w:proofErr w:type="spellEnd"/>
-      <w:proofErr w:type="gramEnd"/>
       <w:r>
         <w:rPr>
           <w:rFonts w:ascii="Times New Roman" w:hAnsi="Times New Roman" w:cs="Times New Roman"/>
@@ -942,7 +940,6 @@
         <w:t xml:space="preserve"> and </w:t>
       </w:r>
       <w:proofErr w:type="spellStart"/>
-      <w:proofErr w:type="gramStart"/>
       <w:r>
         <w:rPr>
           <w:rFonts w:ascii="Times New Roman" w:hAnsi="Times New Roman" w:cs="Times New Roman"/>
@@ -971,7 +968,6 @@
         <w:t>Choi</w:t>
       </w:r>
       <w:proofErr w:type="spellEnd"/>
-      <w:proofErr w:type="gramEnd"/>
       <w:r>
         <w:rPr>
           <w:rFonts w:ascii="Times New Roman" w:hAnsi="Times New Roman" w:cs="Times New Roman"/>
@@ -1849,25 +1845,7 @@
           <w:sz w:val="22"/>
           <w:szCs w:val="22"/>
         </w:rPr>
-        <w:t xml:space="preserve">, and Tim F. Liao. Revise and </w:t>
-      </w:r>
-      <w:proofErr w:type="gramStart"/>
-      <w:r>
-        <w:rPr>
-          <w:rFonts w:ascii="Times New Roman" w:hAnsi="Times New Roman" w:cs="Times New Roman"/>
-          <w:sz w:val="22"/>
-          <w:szCs w:val="22"/>
-        </w:rPr>
-        <w:t>Resubmit</w:t>
-      </w:r>
-      <w:proofErr w:type="gramEnd"/>
-      <w:r>
-        <w:rPr>
-          <w:rFonts w:ascii="Times New Roman" w:hAnsi="Times New Roman" w:cs="Times New Roman"/>
-          <w:sz w:val="22"/>
-          <w:szCs w:val="22"/>
-        </w:rPr>
-        <w:t xml:space="preserve">. “Addressing the Fuzzy Cohort Problem in the APC-I Model.” </w:t>
+        <w:t xml:space="preserve">, and Tim F. Liao. Revise and Resubmit. “Addressing the Fuzzy Cohort Problem in the APC-I Model.” </w:t>
       </w:r>
       <w:r>
         <w:rPr>
@@ -1929,18 +1907,8 @@
           <w:sz w:val="22"/>
           <w:szCs w:val="22"/>
         </w:rPr>
-        <w:t xml:space="preserve">Revise and </w:t>
-      </w:r>
-      <w:proofErr w:type="gramStart"/>
-      <w:r>
-        <w:rPr>
-          <w:rFonts w:ascii="Times New Roman" w:hAnsi="Times New Roman" w:cs="Times New Roman" w:hint="eastAsia"/>
-          <w:sz w:val="22"/>
-          <w:szCs w:val="22"/>
-        </w:rPr>
-        <w:t>Resubmit</w:t>
-      </w:r>
-      <w:proofErr w:type="gramEnd"/>
+        <w:t>Revise and Resubmit</w:t>
+      </w:r>
       <w:r>
         <w:rPr>
           <w:rFonts w:ascii="Times New Roman" w:hAnsi="Times New Roman" w:cs="Times New Roman"/>
@@ -2037,17 +2005,17 @@
       <w:pPr>
         <w:spacing w:after="0" w:line="240" w:lineRule="auto"/>
         <w:rPr>
+          <w:rFonts w:ascii="Times New Roman" w:hAnsi="Times New Roman" w:cs="Times New Roman"/>
+          <w:sz w:val="22"/>
+          <w:szCs w:val="22"/>
+        </w:rPr>
+      </w:pPr>
+      <w:r>
+        <w:rPr>
           <w:rFonts w:ascii="Times New Roman" w:hAnsi="Times New Roman" w:cs="Times New Roman" w:hint="eastAsia"/>
           <w:sz w:val="22"/>
           <w:szCs w:val="22"/>
         </w:rPr>
-      </w:pPr>
-      <w:r>
-        <w:rPr>
-          <w:rFonts w:ascii="Times New Roman" w:hAnsi="Times New Roman" w:cs="Times New Roman" w:hint="eastAsia"/>
-          <w:sz w:val="22"/>
-          <w:szCs w:val="22"/>
-        </w:rPr>
         <w:t>Sohee Shin</w:t>
       </w:r>
       <w:r>
@@ -2083,30 +2051,6 @@
           <w:szCs w:val="22"/>
         </w:rPr>
         <w:t xml:space="preserve">In Progress. “Labor Market Trajectories and Midlife Health: The Long-Term Consequences of Occupational Stratification.” </w:t>
-      </w:r>
-      <w:r>
-        <w:rPr>
-          <w:rFonts w:ascii="Times New Roman" w:hAnsi="Times New Roman" w:cs="Times New Roman" w:hint="eastAsia"/>
-          <w:sz w:val="22"/>
-          <w:szCs w:val="22"/>
-        </w:rPr>
-        <w:t>(</w:t>
-      </w:r>
-      <w:r>
-        <w:rPr>
-          <w:rFonts w:ascii="Times New Roman" w:hAnsi="Times New Roman" w:cs="Times New Roman"/>
-          <w:sz w:val="22"/>
-          <w:szCs w:val="22"/>
-        </w:rPr>
-        <w:t>full</w:t>
-      </w:r>
-      <w:r>
-        <w:rPr>
-          <w:rFonts w:ascii="Times New Roman" w:hAnsi="Times New Roman" w:cs="Times New Roman" w:hint="eastAsia"/>
-          <w:sz w:val="22"/>
-          <w:szCs w:val="22"/>
-        </w:rPr>
-        <w:t xml:space="preserve"> manuscript available)</w:t>
       </w:r>
     </w:p>
     <w:p>
@@ -2142,61 +2086,43 @@
           <w:sz w:val="22"/>
           <w:szCs w:val="22"/>
         </w:rPr>
+        <w:t xml:space="preserve">. </w:t>
+      </w:r>
+      <w:r>
+        <w:rPr>
+          <w:rFonts w:ascii="Times New Roman" w:hAnsi="Times New Roman" w:cs="Times New Roman"/>
+          <w:sz w:val="22"/>
+          <w:szCs w:val="22"/>
+        </w:rPr>
+        <w:t>“</w:t>
+      </w:r>
+      <w:r>
+        <w:rPr>
+          <w:rFonts w:ascii="Times New Roman" w:hAnsi="Times New Roman" w:cs="Times New Roman" w:hint="eastAsia"/>
+        </w:rPr>
+        <w:t>Beyond the Educational Gap: Absolute Attainment, Spousal Pairing, and Marriage Migrants</w:t>
+      </w:r>
+      <w:r>
+        <w:rPr>
+          <w:rFonts w:ascii="Times New Roman" w:hAnsi="Times New Roman" w:cs="Times New Roman"/>
+        </w:rPr>
+        <w:t>’</w:t>
+      </w:r>
+      <w:r>
+        <w:rPr>
+          <w:rFonts w:ascii="Times New Roman" w:hAnsi="Times New Roman" w:cs="Times New Roman" w:hint="eastAsia"/>
+        </w:rPr>
+        <w:t xml:space="preserve"> Labor Market Outcomes in South Korea</w:t>
+      </w:r>
+      <w:r>
+        <w:rPr>
+          <w:rFonts w:ascii="Times New Roman" w:hAnsi="Times New Roman" w:cs="Times New Roman" w:hint="eastAsia"/>
+        </w:rPr>
         <w:t>.</w:t>
       </w:r>
       <w:r>
         <w:rPr>
-          <w:rFonts w:ascii="Times New Roman" w:hAnsi="Times New Roman" w:cs="Times New Roman" w:hint="eastAsia"/>
-          <w:sz w:val="22"/>
-          <w:szCs w:val="22"/>
-        </w:rPr>
-        <w:t xml:space="preserve"> In Progress.</w:t>
-      </w:r>
-      <w:r>
-        <w:rPr>
-          <w:rFonts w:ascii="Times New Roman" w:hAnsi="Times New Roman" w:cs="Times New Roman"/>
-          <w:sz w:val="22"/>
-          <w:szCs w:val="22"/>
-        </w:rPr>
-        <w:t xml:space="preserve"> </w:t>
-      </w:r>
-      <w:r>
-        <w:rPr>
-          <w:rFonts w:ascii="Times New Roman" w:hAnsi="Times New Roman" w:cs="Times New Roman"/>
-          <w:sz w:val="22"/>
-          <w:szCs w:val="22"/>
-        </w:rPr>
-        <w:t>“</w:t>
-      </w:r>
-      <w:r>
-        <w:rPr>
-          <w:rFonts w:ascii="Times New Roman" w:hAnsi="Times New Roman" w:cs="Times New Roman" w:hint="eastAsia"/>
-          <w:sz w:val="22"/>
-          <w:szCs w:val="22"/>
-        </w:rPr>
-        <w:t>Beyond the Educational Gap: Absolute Attainment, Spousal Pairing, and Marriage Migrants</w:t>
-      </w:r>
-      <w:r>
-        <w:rPr>
-          <w:rFonts w:ascii="Times New Roman" w:hAnsi="Times New Roman" w:cs="Times New Roman"/>
-          <w:sz w:val="22"/>
-          <w:szCs w:val="22"/>
-        </w:rPr>
-        <w:t>’</w:t>
-      </w:r>
-      <w:r>
-        <w:rPr>
-          <w:rFonts w:ascii="Times New Roman" w:hAnsi="Times New Roman" w:cs="Times New Roman" w:hint="eastAsia"/>
-          <w:sz w:val="22"/>
-          <w:szCs w:val="22"/>
-        </w:rPr>
-        <w:t xml:space="preserve"> Labor Market Outcomes in South Korea.</w:t>
-      </w:r>
-      <w:r>
-        <w:rPr>
-          <w:rFonts w:ascii="Times New Roman" w:hAnsi="Times New Roman" w:cs="Times New Roman"/>
-          <w:sz w:val="22"/>
-          <w:szCs w:val="22"/>
+          <w:rFonts w:ascii="Times New Roman" w:hAnsi="Times New Roman" w:cs="Times New Roman"/>
         </w:rPr>
         <w:t>”</w:t>
       </w:r>
@@ -2206,31 +2132,7 @@
           <w:sz w:val="22"/>
           <w:szCs w:val="22"/>
         </w:rPr>
-        <w:t xml:space="preserve"> </w:t>
-      </w:r>
-      <w:r>
-        <w:rPr>
-          <w:rFonts w:ascii="Times New Roman" w:hAnsi="Times New Roman" w:cs="Times New Roman" w:hint="eastAsia"/>
-          <w:sz w:val="22"/>
-          <w:szCs w:val="22"/>
-        </w:rPr>
-        <w:t>(</w:t>
-      </w:r>
-      <w:r>
-        <w:rPr>
-          <w:rFonts w:ascii="Times New Roman" w:hAnsi="Times New Roman" w:cs="Times New Roman"/>
-          <w:sz w:val="22"/>
-          <w:szCs w:val="22"/>
-        </w:rPr>
-        <w:t>full</w:t>
-      </w:r>
-      <w:r>
-        <w:rPr>
-          <w:rFonts w:ascii="Times New Roman" w:hAnsi="Times New Roman" w:cs="Times New Roman" w:hint="eastAsia"/>
-          <w:sz w:val="22"/>
-          <w:szCs w:val="22"/>
-        </w:rPr>
-        <w:t xml:space="preserve"> manuscript available)</w:t>
+        <w:t xml:space="preserve"> (Manuscript available upon request)</w:t>
       </w:r>
     </w:p>
     <w:p>
@@ -2248,55 +2150,57 @@
           <w:sz w:val="22"/>
           <w:szCs w:val="22"/>
         </w:rPr>
-        <w:t>Sohee Shin</w:t>
-      </w:r>
-      <w:r>
-        <w:rPr>
-          <w:rFonts w:ascii="Times New Roman" w:hAnsi="Times New Roman" w:cs="Times New Roman"/>
-          <w:sz w:val="22"/>
-          <w:szCs w:val="22"/>
-        </w:rPr>
-        <w:t xml:space="preserve">. </w:t>
-      </w:r>
-      <w:r>
-        <w:rPr>
-          <w:rFonts w:ascii="Times New Roman" w:hAnsi="Times New Roman" w:cs="Times New Roman" w:hint="eastAsia"/>
-          <w:sz w:val="22"/>
-          <w:szCs w:val="22"/>
-        </w:rPr>
-        <w:t xml:space="preserve">In Progress. </w:t>
-      </w:r>
-      <w:r>
-        <w:rPr>
-          <w:rFonts w:ascii="Times New Roman" w:hAnsi="Times New Roman" w:cs="Times New Roman"/>
-          <w:sz w:val="22"/>
-          <w:szCs w:val="22"/>
-        </w:rPr>
-        <w:t xml:space="preserve">“Negotiating Housework in Transnational Marriages: The Role of Gender Ideology Alignment and Economic Resources among Marriage Migrant Women in Korea.” </w:t>
-      </w:r>
-      <w:r>
-        <w:rPr>
-          <w:rFonts w:ascii="Times New Roman" w:hAnsi="Times New Roman" w:cs="Times New Roman" w:hint="eastAsia"/>
-          <w:sz w:val="22"/>
-          <w:szCs w:val="22"/>
-        </w:rPr>
-        <w:t>(</w:t>
-      </w:r>
-      <w:r>
-        <w:rPr>
-          <w:rFonts w:ascii="Times New Roman" w:hAnsi="Times New Roman" w:cs="Times New Roman"/>
-          <w:sz w:val="22"/>
-          <w:szCs w:val="22"/>
-        </w:rPr>
-        <w:t>full</w:t>
-      </w:r>
-      <w:r>
-        <w:rPr>
-          <w:rFonts w:ascii="Times New Roman" w:hAnsi="Times New Roman" w:cs="Times New Roman" w:hint="eastAsia"/>
-          <w:sz w:val="22"/>
-          <w:szCs w:val="22"/>
-        </w:rPr>
-        <w:t xml:space="preserve"> manuscript available)</w:t>
+        <w:t>Jina Lee,</w:t>
+      </w:r>
+      <w:r>
+        <w:rPr>
+          <w:rFonts w:ascii="Times New Roman" w:hAnsi="Times New Roman" w:cs="Times New Roman"/>
+          <w:sz w:val="22"/>
+          <w:szCs w:val="22"/>
+        </w:rPr>
+        <w:t xml:space="preserve"> Sohee Shin, </w:t>
+      </w:r>
+      <w:proofErr w:type="spellStart"/>
+      <w:r>
+        <w:rPr>
+          <w:rFonts w:ascii="Times New Roman" w:hAnsi="Times New Roman" w:cs="Times New Roman"/>
+          <w:sz w:val="22"/>
+          <w:szCs w:val="22"/>
+        </w:rPr>
+        <w:t>Ziying</w:t>
+      </w:r>
+      <w:proofErr w:type="spellEnd"/>
+      <w:r>
+        <w:rPr>
+          <w:rFonts w:ascii="Times New Roman" w:hAnsi="Times New Roman" w:cs="Times New Roman"/>
+          <w:sz w:val="22"/>
+          <w:szCs w:val="22"/>
+        </w:rPr>
+        <w:t xml:space="preserve"> Yang. </w:t>
+      </w:r>
+      <w:r>
+        <w:rPr>
+          <w:rFonts w:ascii="Times New Roman" w:hAnsi="Times New Roman" w:cs="Times New Roman"/>
+          <w:sz w:val="22"/>
+          <w:szCs w:val="22"/>
+        </w:rPr>
+        <w:t>“</w:t>
+      </w:r>
+      <w:r>
+        <w:rPr>
+          <w:rFonts w:ascii="Times New Roman" w:hAnsi="Times New Roman" w:cs="Times New Roman"/>
+          <w:sz w:val="22"/>
+          <w:szCs w:val="22"/>
+        </w:rPr>
+        <w:t>Gendered Returns to Claiming Novelty.</w:t>
+      </w:r>
+      <w:r>
+        <w:rPr>
+          <w:rFonts w:ascii="Times New Roman" w:hAnsi="Times New Roman" w:cs="Times New Roman"/>
+          <w:sz w:val="22"/>
+          <w:szCs w:val="22"/>
+        </w:rPr>
+        <w:t>”</w:t>
       </w:r>
     </w:p>
     <w:p>
@@ -2324,65 +2228,15 @@
           <w:sz w:val="22"/>
           <w:szCs w:val="22"/>
         </w:rPr>
-        <w:t>Jina Lee,</w:t>
-      </w:r>
-      <w:r>
-        <w:rPr>
-          <w:rFonts w:ascii="Times New Roman" w:hAnsi="Times New Roman" w:cs="Times New Roman"/>
-          <w:sz w:val="22"/>
-          <w:szCs w:val="22"/>
-        </w:rPr>
-        <w:t xml:space="preserve"> Sohee Shin, </w:t>
-      </w:r>
-      <w:proofErr w:type="spellStart"/>
-      <w:r>
-        <w:rPr>
-          <w:rFonts w:ascii="Times New Roman" w:hAnsi="Times New Roman" w:cs="Times New Roman"/>
-          <w:sz w:val="22"/>
-          <w:szCs w:val="22"/>
-        </w:rPr>
-        <w:t>Ziying</w:t>
-      </w:r>
-      <w:proofErr w:type="spellEnd"/>
-      <w:r>
-        <w:rPr>
-          <w:rFonts w:ascii="Times New Roman" w:hAnsi="Times New Roman" w:cs="Times New Roman"/>
-          <w:sz w:val="22"/>
-          <w:szCs w:val="22"/>
-        </w:rPr>
-        <w:t xml:space="preserve"> Yang. </w:t>
-      </w:r>
-      <w:r>
-        <w:rPr>
-          <w:rFonts w:ascii="Times New Roman" w:hAnsi="Times New Roman" w:cs="Times New Roman" w:hint="eastAsia"/>
-          <w:sz w:val="22"/>
-          <w:szCs w:val="22"/>
-        </w:rPr>
-        <w:t xml:space="preserve">In Progress. </w:t>
-      </w:r>
-      <w:r>
-        <w:rPr>
-          <w:rFonts w:ascii="Times New Roman" w:hAnsi="Times New Roman" w:cs="Times New Roman"/>
-          <w:sz w:val="22"/>
-          <w:szCs w:val="22"/>
-        </w:rPr>
-        <w:t>“</w:t>
-      </w:r>
-      <w:r>
-        <w:rPr>
-          <w:rFonts w:ascii="Times New Roman" w:hAnsi="Times New Roman" w:cs="Times New Roman"/>
-          <w:sz w:val="22"/>
-          <w:szCs w:val="22"/>
-        </w:rPr>
-        <w:t>Gendered Returns to Claiming Novelty.</w:t>
-      </w:r>
-      <w:r>
-        <w:rPr>
-          <w:rFonts w:ascii="Times New Roman" w:hAnsi="Times New Roman" w:cs="Times New Roman"/>
-          <w:sz w:val="22"/>
-          <w:szCs w:val="22"/>
-        </w:rPr>
-        <w:t>”</w:t>
+        <w:t>Sohee Shin</w:t>
+      </w:r>
+      <w:r>
+        <w:rPr>
+          <w:rFonts w:ascii="Times New Roman" w:hAnsi="Times New Roman" w:cs="Times New Roman"/>
+          <w:sz w:val="22"/>
+          <w:szCs w:val="22"/>
+        </w:rPr>
+        <w:t>. “Negotiating Housework in Transnational Marriages: The Role of Gender Ideology Alignment and Economic Resources among Marriage Migrant Women in Korea.” (Manuscript available upon request)</w:t>
       </w:r>
     </w:p>
     <w:p>
@@ -3119,18 +2973,18 @@
           <w:p>
             <w:pPr>
               <w:rPr>
-                <w:rFonts w:ascii="Times New Roman" w:hAnsi="Times New Roman" w:cs="Times New Roman"/>
-                <w:sz w:val="22"/>
-                <w:szCs w:val="22"/>
-              </w:rPr>
-            </w:pPr>
-            <w:r>
-              <w:rPr>
-                <w:rFonts w:ascii="Times New Roman" w:hAnsi="Times New Roman" w:cs="Times New Roman" w:hint="eastAsia"/>
-                <w:sz w:val="22"/>
-                <w:szCs w:val="22"/>
-              </w:rPr>
-              <w:t xml:space="preserve">2026 </w:t>
+                <w:rFonts w:ascii="Times New Roman" w:hAnsi="Times New Roman" w:cs="Times New Roman" w:hint="eastAsia"/>
+                <w:sz w:val="22"/>
+                <w:szCs w:val="22"/>
+              </w:rPr>
+            </w:pPr>
+            <w:r>
+              <w:rPr>
+                <w:rFonts w:ascii="Times New Roman" w:hAnsi="Times New Roman" w:cs="Times New Roman" w:hint="eastAsia"/>
+                <w:sz w:val="22"/>
+                <w:szCs w:val="22"/>
+              </w:rPr>
+              <w:t>2026</w:t>
             </w:r>
           </w:p>
         </w:tc>
@@ -3142,45 +2996,123 @@
             <w:pPr>
               <w:rPr>
                 <w:rFonts w:ascii="Times New Roman" w:hAnsi="Times New Roman" w:cs="Times New Roman"/>
+                <w:sz w:val="22"/>
+                <w:szCs w:val="22"/>
+              </w:rPr>
+            </w:pPr>
+            <w:r>
+              <w:rPr>
+                <w:rFonts w:ascii="Times New Roman" w:hAnsi="Times New Roman" w:cs="Times New Roman" w:hint="eastAsia"/>
                 <w:b/>
                 <w:bCs/>
                 <w:sz w:val="22"/>
                 <w:szCs w:val="22"/>
               </w:rPr>
-            </w:pPr>
-            <w:r>
-              <w:rPr>
-                <w:rFonts w:ascii="Times New Roman" w:hAnsi="Times New Roman" w:cs="Times New Roman" w:hint="eastAsia"/>
-                <w:b/>
-                <w:bCs/>
-                <w:sz w:val="22"/>
-                <w:szCs w:val="22"/>
-              </w:rPr>
-              <w:t xml:space="preserve">Sohee Shin. </w:t>
-            </w:r>
-            <w:r>
-              <w:rPr>
-                <w:rFonts w:ascii="Times New Roman" w:hAnsi="Times New Roman" w:cs="Times New Roman"/>
-                <w:sz w:val="22"/>
-                <w:szCs w:val="22"/>
-              </w:rPr>
-              <w:t>"Spousal Resources and the Paradox of Labor Market Incorporation among Marriage Migrant Women in South Korea"</w:t>
-            </w:r>
-            <w:r>
-              <w:rPr>
-                <w:rFonts w:ascii="Times New Roman" w:hAnsi="Times New Roman" w:cs="Times New Roman" w:hint="eastAsia"/>
-                <w:sz w:val="22"/>
-                <w:szCs w:val="22"/>
-              </w:rPr>
-              <w:t>, paper presented at the 2026 American Sociological Association (roundtable), August 2026, New York, USA</w:t>
-            </w:r>
-          </w:p>
-          <w:p>
-            <w:pPr>
-              <w:rPr>
-                <w:rFonts w:ascii="Times New Roman" w:hAnsi="Times New Roman" w:cs="Times New Roman"/>
-                <w:b/>
-                <w:bCs/>
+              <w:t xml:space="preserve">Sohee Shin </w:t>
+            </w:r>
+            <w:r>
+              <w:rPr>
+                <w:rFonts w:ascii="Times New Roman" w:hAnsi="Times New Roman" w:cs="Times New Roman" w:hint="eastAsia"/>
+                <w:sz w:val="22"/>
+                <w:szCs w:val="22"/>
+              </w:rPr>
+              <w:t xml:space="preserve">&amp; </w:t>
+            </w:r>
+            <w:proofErr w:type="spellStart"/>
+            <w:r>
+              <w:rPr>
+                <w:rFonts w:ascii="Times New Roman" w:hAnsi="Times New Roman" w:cs="Times New Roman" w:hint="eastAsia"/>
+                <w:sz w:val="22"/>
+                <w:szCs w:val="22"/>
+              </w:rPr>
+              <w:t>Jeehae</w:t>
+            </w:r>
+            <w:proofErr w:type="spellEnd"/>
+            <w:r>
+              <w:rPr>
+                <w:rFonts w:ascii="Times New Roman" w:hAnsi="Times New Roman" w:cs="Times New Roman" w:hint="eastAsia"/>
+                <w:sz w:val="22"/>
+                <w:szCs w:val="22"/>
+              </w:rPr>
+              <w:t xml:space="preserve"> Kang, </w:t>
+            </w:r>
+            <w:r>
+              <w:rPr>
+                <w:rFonts w:ascii="Times New Roman" w:hAnsi="Times New Roman" w:cs="Times New Roman"/>
+                <w:sz w:val="22"/>
+                <w:szCs w:val="22"/>
+              </w:rPr>
+              <w:t>“</w:t>
+            </w:r>
+            <w:r>
+              <w:rPr>
+                <w:rFonts w:ascii="Times New Roman" w:hAnsi="Times New Roman" w:cs="Times New Roman" w:hint="eastAsia"/>
+                <w:sz w:val="22"/>
+                <w:szCs w:val="22"/>
+              </w:rPr>
+              <w:t xml:space="preserve">Employment </w:t>
+            </w:r>
+            <w:r>
+              <w:rPr>
+                <w:rFonts w:ascii="Times New Roman" w:hAnsi="Times New Roman" w:cs="Times New Roman" w:hint="eastAsia"/>
+                <w:sz w:val="22"/>
+                <w:szCs w:val="22"/>
+              </w:rPr>
+              <w:t>Relations and Midlife Health: Cumulative Disadvantage across Life Course</w:t>
+            </w:r>
+            <w:r>
+              <w:rPr>
+                <w:rFonts w:ascii="Times New Roman" w:hAnsi="Times New Roman" w:cs="Times New Roman"/>
+                <w:sz w:val="22"/>
+                <w:szCs w:val="22"/>
+              </w:rPr>
+              <w:t>”</w:t>
+            </w:r>
+            <w:r>
+              <w:rPr>
+                <w:rFonts w:ascii="Times New Roman" w:hAnsi="Times New Roman" w:cs="Times New Roman" w:hint="eastAsia"/>
+                <w:sz w:val="22"/>
+                <w:szCs w:val="22"/>
+              </w:rPr>
+              <w:t>, paper presented at the Demography Circle (</w:t>
+            </w:r>
+            <w:r>
+              <w:rPr>
+                <w:rFonts w:ascii="Times New Roman" w:hAnsi="Times New Roman" w:cs="Times New Roman" w:hint="eastAsia"/>
+                <w:sz w:val="22"/>
+                <w:szCs w:val="22"/>
+              </w:rPr>
+              <w:t>Department of Sociology</w:t>
+            </w:r>
+            <w:r>
+              <w:rPr>
+                <w:rFonts w:ascii="Times New Roman" w:hAnsi="Times New Roman" w:cs="Times New Roman" w:hint="eastAsia"/>
+                <w:sz w:val="22"/>
+                <w:szCs w:val="22"/>
+              </w:rPr>
+              <w:t xml:space="preserve">), </w:t>
+            </w:r>
+            <w:r>
+              <w:rPr>
+                <w:rFonts w:ascii="Times New Roman" w:hAnsi="Times New Roman" w:cs="Times New Roman" w:hint="eastAsia"/>
+                <w:sz w:val="22"/>
+                <w:szCs w:val="22"/>
+              </w:rPr>
+              <w:t>October 2026</w:t>
+            </w:r>
+            <w:r>
+              <w:rPr>
+                <w:rFonts w:ascii="Times New Roman" w:hAnsi="Times New Roman" w:cs="Times New Roman" w:hint="eastAsia"/>
+                <w:sz w:val="22"/>
+                <w:szCs w:val="22"/>
+              </w:rPr>
+              <w:t>, University of Illinois at Urbana-Champaign, USA</w:t>
+            </w:r>
+          </w:p>
+          <w:p>
+            <w:pPr>
+              <w:rPr>
+                <w:rFonts w:ascii="Times New Roman" w:hAnsi="Times New Roman" w:cs="Times New Roman" w:hint="eastAsia"/>
                 <w:sz w:val="22"/>
                 <w:szCs w:val="22"/>
               </w:rPr>
@@ -3210,7 +3142,7 @@
                 <w:sz w:val="22"/>
                 <w:szCs w:val="22"/>
               </w:rPr>
-              <w:t>2026</w:t>
+              <w:t xml:space="preserve">2026 </w:t>
             </w:r>
           </w:p>
         </w:tc>
@@ -3222,18 +3154,20 @@
             <w:pPr>
               <w:rPr>
                 <w:rFonts w:ascii="Times New Roman" w:hAnsi="Times New Roman" w:cs="Times New Roman"/>
-                <w:sz w:val="22"/>
-                <w:szCs w:val="22"/>
-              </w:rPr>
-            </w:pPr>
-            <w:r>
-              <w:rPr>
-                <w:rFonts w:ascii="Times New Roman" w:hAnsi="Times New Roman" w:cs="Times New Roman" w:hint="eastAsia"/>
                 <w:b/>
                 <w:bCs/>
                 <w:sz w:val="22"/>
                 <w:szCs w:val="22"/>
               </w:rPr>
+            </w:pPr>
+            <w:r>
+              <w:rPr>
+                <w:rFonts w:ascii="Times New Roman" w:hAnsi="Times New Roman" w:cs="Times New Roman" w:hint="eastAsia"/>
+                <w:b/>
+                <w:bCs/>
+                <w:sz w:val="22"/>
+                <w:szCs w:val="22"/>
+              </w:rPr>
               <w:t xml:space="preserve">Sohee Shin. </w:t>
             </w:r>
             <w:r>
@@ -3242,146 +3176,27 @@
                 <w:sz w:val="22"/>
                 <w:szCs w:val="22"/>
               </w:rPr>
-              <w:t>“</w:t>
-            </w:r>
-            <w:r>
-              <w:rPr>
-                <w:rFonts w:ascii="Times New Roman" w:hAnsi="Times New Roman" w:cs="Times New Roman" w:hint="eastAsia"/>
-                <w:sz w:val="22"/>
-                <w:szCs w:val="22"/>
-              </w:rPr>
-              <w:t>Negotiating Housework in Transnational Marriages: The Role of Gender Ideology Alignment and Economic Resources among Mariage migrant Women in Korea</w:t>
-            </w:r>
-            <w:r>
-              <w:rPr>
-                <w:rFonts w:ascii="Times New Roman" w:hAnsi="Times New Roman" w:cs="Times New Roman"/>
-                <w:sz w:val="22"/>
-                <w:szCs w:val="22"/>
-              </w:rPr>
-              <w:t>”</w:t>
-            </w:r>
-            <w:r>
-              <w:rPr>
-                <w:rFonts w:ascii="Times New Roman" w:hAnsi="Times New Roman" w:cs="Times New Roman" w:hint="eastAsia"/>
-                <w:sz w:val="22"/>
-                <w:szCs w:val="22"/>
-              </w:rPr>
-              <w:t xml:space="preserve">, </w:t>
-            </w:r>
-            <w:r>
-              <w:rPr>
-                <w:rFonts w:ascii="Times New Roman" w:hAnsi="Times New Roman" w:cs="Times New Roman"/>
-                <w:sz w:val="22"/>
-                <w:szCs w:val="22"/>
-              </w:rPr>
-              <w:t xml:space="preserve">paper presented at </w:t>
-            </w:r>
-            <w:r>
-              <w:rPr>
-                <w:rFonts w:ascii="Times New Roman" w:hAnsi="Times New Roman" w:cs="Times New Roman"/>
-                <w:i/>
-                <w:iCs/>
-                <w:sz w:val="22"/>
-                <w:szCs w:val="22"/>
-              </w:rPr>
-              <w:t>the 202</w:t>
-            </w:r>
-            <w:r>
-              <w:rPr>
-                <w:rFonts w:ascii="Times New Roman" w:hAnsi="Times New Roman" w:cs="Times New Roman" w:hint="eastAsia"/>
-                <w:i/>
-                <w:iCs/>
-                <w:sz w:val="22"/>
-                <w:szCs w:val="22"/>
-              </w:rPr>
-              <w:t>6</w:t>
-            </w:r>
-            <w:r>
-              <w:rPr>
-                <w:rFonts w:ascii="Times New Roman" w:hAnsi="Times New Roman" w:cs="Times New Roman"/>
-                <w:i/>
-                <w:iCs/>
-                <w:sz w:val="22"/>
-                <w:szCs w:val="22"/>
-              </w:rPr>
-              <w:t xml:space="preserve"> Population Association of America (</w:t>
-            </w:r>
-            <w:r>
-              <w:rPr>
-                <w:rFonts w:ascii="Times New Roman" w:hAnsi="Times New Roman" w:cs="Times New Roman" w:hint="eastAsia"/>
-                <w:i/>
-                <w:iCs/>
-                <w:sz w:val="22"/>
-                <w:szCs w:val="22"/>
-              </w:rPr>
-              <w:t>oral</w:t>
-            </w:r>
-            <w:r>
-              <w:rPr>
-                <w:rFonts w:ascii="Times New Roman" w:hAnsi="Times New Roman" w:cs="Times New Roman"/>
-                <w:i/>
-                <w:iCs/>
-                <w:sz w:val="22"/>
-                <w:szCs w:val="22"/>
-              </w:rPr>
-              <w:t xml:space="preserve"> session)</w:t>
-            </w:r>
-            <w:r>
-              <w:rPr>
-                <w:rFonts w:ascii="Times New Roman" w:hAnsi="Times New Roman" w:cs="Times New Roman"/>
-                <w:sz w:val="22"/>
-                <w:szCs w:val="22"/>
-              </w:rPr>
-              <w:t xml:space="preserve">, </w:t>
-            </w:r>
-            <w:r>
-              <w:rPr>
-                <w:rFonts w:ascii="Times New Roman" w:hAnsi="Times New Roman" w:cs="Times New Roman" w:hint="eastAsia"/>
-                <w:sz w:val="22"/>
-                <w:szCs w:val="22"/>
-              </w:rPr>
-              <w:t>May</w:t>
-            </w:r>
-            <w:r>
-              <w:rPr>
-                <w:rFonts w:ascii="Times New Roman" w:hAnsi="Times New Roman" w:cs="Times New Roman"/>
-                <w:sz w:val="22"/>
-                <w:szCs w:val="22"/>
-              </w:rPr>
-              <w:t xml:space="preserve"> 202</w:t>
-            </w:r>
-            <w:r>
-              <w:rPr>
-                <w:rFonts w:ascii="Times New Roman" w:hAnsi="Times New Roman" w:cs="Times New Roman" w:hint="eastAsia"/>
-                <w:sz w:val="22"/>
-                <w:szCs w:val="22"/>
-              </w:rPr>
-              <w:t>6</w:t>
-            </w:r>
-            <w:r>
-              <w:rPr>
-                <w:rFonts w:ascii="Times New Roman" w:hAnsi="Times New Roman" w:cs="Times New Roman"/>
-                <w:sz w:val="22"/>
-                <w:szCs w:val="22"/>
-              </w:rPr>
-              <w:t xml:space="preserve"> in </w:t>
-            </w:r>
-            <w:r>
-              <w:rPr>
-                <w:rFonts w:ascii="Times New Roman" w:hAnsi="Times New Roman" w:cs="Times New Roman" w:hint="eastAsia"/>
-                <w:sz w:val="22"/>
-                <w:szCs w:val="22"/>
-              </w:rPr>
-              <w:t>Saint Louis</w:t>
-            </w:r>
-            <w:r>
-              <w:rPr>
-                <w:rFonts w:ascii="Times New Roman" w:hAnsi="Times New Roman" w:cs="Times New Roman"/>
-                <w:sz w:val="22"/>
-                <w:szCs w:val="22"/>
-              </w:rPr>
-              <w:t>, USA</w:t>
-            </w:r>
+              <w:t>"Spousal Resources and the Paradox of Labor Market Incorporation among Marriage Migrant Women in South Korea"</w:t>
+            </w:r>
+            <w:r>
+              <w:rPr>
+                <w:rFonts w:ascii="Times New Roman" w:hAnsi="Times New Roman" w:cs="Times New Roman" w:hint="eastAsia"/>
+                <w:sz w:val="22"/>
+                <w:szCs w:val="22"/>
+              </w:rPr>
+              <w:t>, paper presented at the 2026 American Sociological Association (roundtable), August 2026, New York, USA</w:t>
+            </w:r>
+          </w:p>
+          <w:p>
+            <w:pPr>
+              <w:rPr>
+                <w:rFonts w:ascii="Times New Roman" w:hAnsi="Times New Roman" w:cs="Times New Roman"/>
+                <w:b/>
+                <w:bCs/>
+                <w:sz w:val="22"/>
+                <w:szCs w:val="22"/>
+              </w:rPr>
+            </w:pPr>
           </w:p>
         </w:tc>
       </w:tr>
@@ -3401,6 +3216,14 @@
                 <w:szCs w:val="22"/>
               </w:rPr>
             </w:pPr>
+            <w:r>
+              <w:rPr>
+                <w:rFonts w:ascii="Times New Roman" w:hAnsi="Times New Roman" w:cs="Times New Roman" w:hint="eastAsia"/>
+                <w:sz w:val="22"/>
+                <w:szCs w:val="22"/>
+              </w:rPr>
+              <w:t>2026</w:t>
+            </w:r>
           </w:p>
         </w:tc>
         <w:tc>
@@ -3411,12 +3234,166 @@
             <w:pPr>
               <w:rPr>
                 <w:rFonts w:ascii="Times New Roman" w:hAnsi="Times New Roman" w:cs="Times New Roman"/>
+                <w:sz w:val="22"/>
+                <w:szCs w:val="22"/>
+              </w:rPr>
+            </w:pPr>
+            <w:r>
+              <w:rPr>
+                <w:rFonts w:ascii="Times New Roman" w:hAnsi="Times New Roman" w:cs="Times New Roman" w:hint="eastAsia"/>
                 <w:b/>
                 <w:bCs/>
                 <w:sz w:val="22"/>
                 <w:szCs w:val="22"/>
               </w:rPr>
-            </w:pPr>
+              <w:t xml:space="preserve">Sohee Shin. </w:t>
+            </w:r>
+            <w:r>
+              <w:rPr>
+                <w:rFonts w:ascii="Times New Roman" w:hAnsi="Times New Roman" w:cs="Times New Roman"/>
+                <w:sz w:val="22"/>
+                <w:szCs w:val="22"/>
+              </w:rPr>
+              <w:t>“</w:t>
+            </w:r>
+            <w:r>
+              <w:rPr>
+                <w:rFonts w:ascii="Times New Roman" w:hAnsi="Times New Roman" w:cs="Times New Roman" w:hint="eastAsia"/>
+                <w:sz w:val="22"/>
+                <w:szCs w:val="22"/>
+              </w:rPr>
+              <w:t>Negotiating Housework in Transnational Marriages: The Role of Gender Ideology Alignment and Economic Resources among Mariage migrant Women in Korea</w:t>
+            </w:r>
+            <w:r>
+              <w:rPr>
+                <w:rFonts w:ascii="Times New Roman" w:hAnsi="Times New Roman" w:cs="Times New Roman"/>
+                <w:sz w:val="22"/>
+                <w:szCs w:val="22"/>
+              </w:rPr>
+              <w:t>”</w:t>
+            </w:r>
+            <w:r>
+              <w:rPr>
+                <w:rFonts w:ascii="Times New Roman" w:hAnsi="Times New Roman" w:cs="Times New Roman" w:hint="eastAsia"/>
+                <w:sz w:val="22"/>
+                <w:szCs w:val="22"/>
+              </w:rPr>
+              <w:t xml:space="preserve">, </w:t>
+            </w:r>
+            <w:r>
+              <w:rPr>
+                <w:rFonts w:ascii="Times New Roman" w:hAnsi="Times New Roman" w:cs="Times New Roman"/>
+                <w:sz w:val="22"/>
+                <w:szCs w:val="22"/>
+              </w:rPr>
+              <w:t xml:space="preserve">paper presented at </w:t>
+            </w:r>
+            <w:r>
+              <w:rPr>
+                <w:rFonts w:ascii="Times New Roman" w:hAnsi="Times New Roman" w:cs="Times New Roman"/>
+                <w:i/>
+                <w:iCs/>
+                <w:sz w:val="22"/>
+                <w:szCs w:val="22"/>
+              </w:rPr>
+              <w:t>the 202</w:t>
+            </w:r>
+            <w:r>
+              <w:rPr>
+                <w:rFonts w:ascii="Times New Roman" w:hAnsi="Times New Roman" w:cs="Times New Roman" w:hint="eastAsia"/>
+                <w:i/>
+                <w:iCs/>
+                <w:sz w:val="22"/>
+                <w:szCs w:val="22"/>
+              </w:rPr>
+              <w:t>6</w:t>
+            </w:r>
+            <w:r>
+              <w:rPr>
+                <w:rFonts w:ascii="Times New Roman" w:hAnsi="Times New Roman" w:cs="Times New Roman"/>
+                <w:i/>
+                <w:iCs/>
+                <w:sz w:val="22"/>
+                <w:szCs w:val="22"/>
+              </w:rPr>
+              <w:t xml:space="preserve"> Population Association of America (</w:t>
+            </w:r>
+            <w:r>
+              <w:rPr>
+                <w:rFonts w:ascii="Times New Roman" w:hAnsi="Times New Roman" w:cs="Times New Roman" w:hint="eastAsia"/>
+                <w:i/>
+                <w:iCs/>
+                <w:sz w:val="22"/>
+                <w:szCs w:val="22"/>
+              </w:rPr>
+              <w:t>oral</w:t>
+            </w:r>
+            <w:r>
+              <w:rPr>
+                <w:rFonts w:ascii="Times New Roman" w:hAnsi="Times New Roman" w:cs="Times New Roman"/>
+                <w:i/>
+                <w:iCs/>
+                <w:sz w:val="22"/>
+                <w:szCs w:val="22"/>
+              </w:rPr>
+              <w:t xml:space="preserve"> session)</w:t>
+            </w:r>
+            <w:r>
+              <w:rPr>
+                <w:rFonts w:ascii="Times New Roman" w:hAnsi="Times New Roman" w:cs="Times New Roman"/>
+                <w:sz w:val="22"/>
+                <w:szCs w:val="22"/>
+              </w:rPr>
+              <w:t xml:space="preserve">, </w:t>
+            </w:r>
+            <w:r>
+              <w:rPr>
+                <w:rFonts w:ascii="Times New Roman" w:hAnsi="Times New Roman" w:cs="Times New Roman" w:hint="eastAsia"/>
+                <w:sz w:val="22"/>
+                <w:szCs w:val="22"/>
+              </w:rPr>
+              <w:t>May</w:t>
+            </w:r>
+            <w:r>
+              <w:rPr>
+                <w:rFonts w:ascii="Times New Roman" w:hAnsi="Times New Roman" w:cs="Times New Roman"/>
+                <w:sz w:val="22"/>
+                <w:szCs w:val="22"/>
+              </w:rPr>
+              <w:t xml:space="preserve"> 202</w:t>
+            </w:r>
+            <w:r>
+              <w:rPr>
+                <w:rFonts w:ascii="Times New Roman" w:hAnsi="Times New Roman" w:cs="Times New Roman" w:hint="eastAsia"/>
+                <w:sz w:val="22"/>
+                <w:szCs w:val="22"/>
+              </w:rPr>
+              <w:t>6</w:t>
+            </w:r>
+            <w:r>
+              <w:rPr>
+                <w:rFonts w:ascii="Times New Roman" w:hAnsi="Times New Roman" w:cs="Times New Roman"/>
+                <w:sz w:val="22"/>
+                <w:szCs w:val="22"/>
+              </w:rPr>
+              <w:t xml:space="preserve"> in </w:t>
+            </w:r>
+            <w:r>
+              <w:rPr>
+                <w:rFonts w:ascii="Times New Roman" w:hAnsi="Times New Roman" w:cs="Times New Roman" w:hint="eastAsia"/>
+                <w:sz w:val="22"/>
+                <w:szCs w:val="22"/>
+              </w:rPr>
+              <w:t>Saint Louis</w:t>
+            </w:r>
+            <w:r>
+              <w:rPr>
+                <w:rFonts w:ascii="Times New Roman" w:hAnsi="Times New Roman" w:cs="Times New Roman"/>
+                <w:sz w:val="22"/>
+                <w:szCs w:val="22"/>
+              </w:rPr>
+              <w:t>, USA</w:t>
+            </w:r>
           </w:p>
         </w:tc>
       </w:tr>
@@ -3436,14 +3413,6 @@
                 <w:szCs w:val="22"/>
               </w:rPr>
             </w:pPr>
-            <w:r>
-              <w:rPr>
-                <w:rFonts w:ascii="Times New Roman" w:hAnsi="Times New Roman" w:cs="Times New Roman" w:hint="eastAsia"/>
-                <w:sz w:val="22"/>
-                <w:szCs w:val="22"/>
-              </w:rPr>
-              <w:t>2026</w:t>
-            </w:r>
           </w:p>
         </w:tc>
         <w:tc>
@@ -3454,146 +3423,12 @@
             <w:pPr>
               <w:rPr>
                 <w:rFonts w:ascii="Times New Roman" w:hAnsi="Times New Roman" w:cs="Times New Roman"/>
-                <w:sz w:val="22"/>
-                <w:szCs w:val="22"/>
-              </w:rPr>
-            </w:pPr>
-            <w:r>
-              <w:rPr>
-                <w:rFonts w:ascii="Times New Roman" w:hAnsi="Times New Roman" w:cs="Times New Roman" w:hint="eastAsia"/>
                 <w:b/>
                 <w:bCs/>
                 <w:sz w:val="22"/>
                 <w:szCs w:val="22"/>
               </w:rPr>
-              <w:t xml:space="preserve">Sohee Shin. </w:t>
-            </w:r>
-            <w:r>
-              <w:rPr>
-                <w:rFonts w:ascii="Times New Roman" w:hAnsi="Times New Roman" w:cs="Times New Roman"/>
-                <w:sz w:val="22"/>
-                <w:szCs w:val="22"/>
-              </w:rPr>
-              <w:t>“</w:t>
-            </w:r>
-            <w:r>
-              <w:rPr>
-                <w:rFonts w:ascii="Times New Roman" w:hAnsi="Times New Roman" w:cs="Times New Roman" w:hint="eastAsia"/>
-                <w:sz w:val="22"/>
-                <w:szCs w:val="22"/>
-              </w:rPr>
-              <w:t>Labor Market Trajectories and Midlife Health: The Long-Term Consequences of Occupational Stratification,</w:t>
-            </w:r>
-            <w:r>
-              <w:rPr>
-                <w:rFonts w:ascii="Times New Roman" w:hAnsi="Times New Roman" w:cs="Times New Roman"/>
-                <w:sz w:val="22"/>
-                <w:szCs w:val="22"/>
-              </w:rPr>
-              <w:t>”</w:t>
-            </w:r>
-            <w:r>
-              <w:rPr>
-                <w:rFonts w:ascii="Times New Roman" w:hAnsi="Times New Roman" w:cs="Times New Roman" w:hint="eastAsia"/>
-                <w:sz w:val="22"/>
-                <w:szCs w:val="22"/>
-              </w:rPr>
-              <w:t xml:space="preserve"> </w:t>
-            </w:r>
-            <w:r>
-              <w:rPr>
-                <w:rFonts w:ascii="Times New Roman" w:hAnsi="Times New Roman" w:cs="Times New Roman"/>
-                <w:sz w:val="22"/>
-                <w:szCs w:val="22"/>
-              </w:rPr>
-              <w:t xml:space="preserve">paper presented at </w:t>
-            </w:r>
-            <w:r>
-              <w:rPr>
-                <w:rFonts w:ascii="Times New Roman" w:hAnsi="Times New Roman" w:cs="Times New Roman"/>
-                <w:i/>
-                <w:iCs/>
-                <w:sz w:val="22"/>
-                <w:szCs w:val="22"/>
-              </w:rPr>
-              <w:t>the 2025 Population Association of America (</w:t>
-            </w:r>
-            <w:r>
-              <w:rPr>
-                <w:rFonts w:ascii="Times New Roman" w:hAnsi="Times New Roman" w:cs="Times New Roman" w:hint="eastAsia"/>
-                <w:i/>
-                <w:iCs/>
-                <w:sz w:val="22"/>
-                <w:szCs w:val="22"/>
-              </w:rPr>
-              <w:t>oral</w:t>
-            </w:r>
-            <w:r>
-              <w:rPr>
-                <w:rFonts w:ascii="Times New Roman" w:hAnsi="Times New Roman" w:cs="Times New Roman"/>
-                <w:i/>
-                <w:iCs/>
-                <w:sz w:val="22"/>
-                <w:szCs w:val="22"/>
-              </w:rPr>
-              <w:t xml:space="preserve"> session)</w:t>
-            </w:r>
-            <w:r>
-              <w:rPr>
-                <w:rFonts w:ascii="Times New Roman" w:hAnsi="Times New Roman" w:cs="Times New Roman"/>
-                <w:sz w:val="22"/>
-                <w:szCs w:val="22"/>
-              </w:rPr>
-              <w:t xml:space="preserve">, </w:t>
-            </w:r>
-            <w:r>
-              <w:rPr>
-                <w:rFonts w:ascii="Times New Roman" w:hAnsi="Times New Roman" w:cs="Times New Roman" w:hint="eastAsia"/>
-                <w:sz w:val="22"/>
-                <w:szCs w:val="22"/>
-              </w:rPr>
-              <w:t>May</w:t>
-            </w:r>
-            <w:r>
-              <w:rPr>
-                <w:rFonts w:ascii="Times New Roman" w:hAnsi="Times New Roman" w:cs="Times New Roman"/>
-                <w:sz w:val="22"/>
-                <w:szCs w:val="22"/>
-              </w:rPr>
-              <w:t xml:space="preserve"> 202</w:t>
-            </w:r>
-            <w:r>
-              <w:rPr>
-                <w:rFonts w:ascii="Times New Roman" w:hAnsi="Times New Roman" w:cs="Times New Roman" w:hint="eastAsia"/>
-                <w:sz w:val="22"/>
-                <w:szCs w:val="22"/>
-              </w:rPr>
-              <w:t>6</w:t>
-            </w:r>
-            <w:r>
-              <w:rPr>
-                <w:rFonts w:ascii="Times New Roman" w:hAnsi="Times New Roman" w:cs="Times New Roman"/>
-                <w:sz w:val="22"/>
-                <w:szCs w:val="22"/>
-              </w:rPr>
-              <w:t xml:space="preserve"> in </w:t>
-            </w:r>
-            <w:r>
-              <w:rPr>
-                <w:rFonts w:ascii="Times New Roman" w:hAnsi="Times New Roman" w:cs="Times New Roman" w:hint="eastAsia"/>
-                <w:sz w:val="22"/>
-                <w:szCs w:val="22"/>
-              </w:rPr>
-              <w:t>Saint Louis</w:t>
-            </w:r>
-            <w:r>
-              <w:rPr>
-                <w:rFonts w:ascii="Times New Roman" w:hAnsi="Times New Roman" w:cs="Times New Roman"/>
-                <w:sz w:val="22"/>
-                <w:szCs w:val="22"/>
-              </w:rPr>
-              <w:t>, USA</w:t>
-            </w:r>
+            </w:pPr>
           </w:p>
         </w:tc>
       </w:tr>
@@ -3613,6 +3448,14 @@
                 <w:szCs w:val="22"/>
               </w:rPr>
             </w:pPr>
+            <w:r>
+              <w:rPr>
+                <w:rFonts w:ascii="Times New Roman" w:hAnsi="Times New Roman" w:cs="Times New Roman" w:hint="eastAsia"/>
+                <w:sz w:val="22"/>
+                <w:szCs w:val="22"/>
+              </w:rPr>
+              <w:t>2026</w:t>
+            </w:r>
           </w:p>
         </w:tc>
         <w:tc>
@@ -3623,12 +3466,146 @@
             <w:pPr>
               <w:rPr>
                 <w:rFonts w:ascii="Times New Roman" w:hAnsi="Times New Roman" w:cs="Times New Roman"/>
+                <w:sz w:val="22"/>
+                <w:szCs w:val="22"/>
+              </w:rPr>
+            </w:pPr>
+            <w:r>
+              <w:rPr>
+                <w:rFonts w:ascii="Times New Roman" w:hAnsi="Times New Roman" w:cs="Times New Roman" w:hint="eastAsia"/>
                 <w:b/>
                 <w:bCs/>
                 <w:sz w:val="22"/>
                 <w:szCs w:val="22"/>
               </w:rPr>
-            </w:pPr>
+              <w:t xml:space="preserve">Sohee Shin. </w:t>
+            </w:r>
+            <w:r>
+              <w:rPr>
+                <w:rFonts w:ascii="Times New Roman" w:hAnsi="Times New Roman" w:cs="Times New Roman"/>
+                <w:sz w:val="22"/>
+                <w:szCs w:val="22"/>
+              </w:rPr>
+              <w:t>“</w:t>
+            </w:r>
+            <w:r>
+              <w:rPr>
+                <w:rFonts w:ascii="Times New Roman" w:hAnsi="Times New Roman" w:cs="Times New Roman" w:hint="eastAsia"/>
+                <w:sz w:val="22"/>
+                <w:szCs w:val="22"/>
+              </w:rPr>
+              <w:t>Labor Market Trajectories and Midlife Health: The Long-Term Consequences of Occupational Stratification,</w:t>
+            </w:r>
+            <w:r>
+              <w:rPr>
+                <w:rFonts w:ascii="Times New Roman" w:hAnsi="Times New Roman" w:cs="Times New Roman"/>
+                <w:sz w:val="22"/>
+                <w:szCs w:val="22"/>
+              </w:rPr>
+              <w:t>”</w:t>
+            </w:r>
+            <w:r>
+              <w:rPr>
+                <w:rFonts w:ascii="Times New Roman" w:hAnsi="Times New Roman" w:cs="Times New Roman" w:hint="eastAsia"/>
+                <w:sz w:val="22"/>
+                <w:szCs w:val="22"/>
+              </w:rPr>
+              <w:t xml:space="preserve"> </w:t>
+            </w:r>
+            <w:r>
+              <w:rPr>
+                <w:rFonts w:ascii="Times New Roman" w:hAnsi="Times New Roman" w:cs="Times New Roman"/>
+                <w:sz w:val="22"/>
+                <w:szCs w:val="22"/>
+              </w:rPr>
+              <w:t xml:space="preserve">paper presented at </w:t>
+            </w:r>
+            <w:r>
+              <w:rPr>
+                <w:rFonts w:ascii="Times New Roman" w:hAnsi="Times New Roman" w:cs="Times New Roman"/>
+                <w:i/>
+                <w:iCs/>
+                <w:sz w:val="22"/>
+                <w:szCs w:val="22"/>
+              </w:rPr>
+              <w:t>the 2025 Population Association of America (</w:t>
+            </w:r>
+            <w:r>
+              <w:rPr>
+                <w:rFonts w:ascii="Times New Roman" w:hAnsi="Times New Roman" w:cs="Times New Roman" w:hint="eastAsia"/>
+                <w:i/>
+                <w:iCs/>
+                <w:sz w:val="22"/>
+                <w:szCs w:val="22"/>
+              </w:rPr>
+              <w:t>oral</w:t>
+            </w:r>
+            <w:r>
+              <w:rPr>
+                <w:rFonts w:ascii="Times New Roman" w:hAnsi="Times New Roman" w:cs="Times New Roman"/>
+                <w:i/>
+                <w:iCs/>
+                <w:sz w:val="22"/>
+                <w:szCs w:val="22"/>
+              </w:rPr>
+              <w:t xml:space="preserve"> session)</w:t>
+            </w:r>
+            <w:r>
+              <w:rPr>
+                <w:rFonts w:ascii="Times New Roman" w:hAnsi="Times New Roman" w:cs="Times New Roman"/>
+                <w:sz w:val="22"/>
+                <w:szCs w:val="22"/>
+              </w:rPr>
+              <w:t xml:space="preserve">, </w:t>
+            </w:r>
+            <w:r>
+              <w:rPr>
+                <w:rFonts w:ascii="Times New Roman" w:hAnsi="Times New Roman" w:cs="Times New Roman" w:hint="eastAsia"/>
+                <w:sz w:val="22"/>
+                <w:szCs w:val="22"/>
+              </w:rPr>
+              <w:t>May</w:t>
+            </w:r>
+            <w:r>
+              <w:rPr>
+                <w:rFonts w:ascii="Times New Roman" w:hAnsi="Times New Roman" w:cs="Times New Roman"/>
+                <w:sz w:val="22"/>
+                <w:szCs w:val="22"/>
+              </w:rPr>
+              <w:t xml:space="preserve"> 202</w:t>
+            </w:r>
+            <w:r>
+              <w:rPr>
+                <w:rFonts w:ascii="Times New Roman" w:hAnsi="Times New Roman" w:cs="Times New Roman" w:hint="eastAsia"/>
+                <w:sz w:val="22"/>
+                <w:szCs w:val="22"/>
+              </w:rPr>
+              <w:t>6</w:t>
+            </w:r>
+            <w:r>
+              <w:rPr>
+                <w:rFonts w:ascii="Times New Roman" w:hAnsi="Times New Roman" w:cs="Times New Roman"/>
+                <w:sz w:val="22"/>
+                <w:szCs w:val="22"/>
+              </w:rPr>
+              <w:t xml:space="preserve"> in </w:t>
+            </w:r>
+            <w:r>
+              <w:rPr>
+                <w:rFonts w:ascii="Times New Roman" w:hAnsi="Times New Roman" w:cs="Times New Roman" w:hint="eastAsia"/>
+                <w:sz w:val="22"/>
+                <w:szCs w:val="22"/>
+              </w:rPr>
+              <w:t>Saint Louis</w:t>
+            </w:r>
+            <w:r>
+              <w:rPr>
+                <w:rFonts w:ascii="Times New Roman" w:hAnsi="Times New Roman" w:cs="Times New Roman"/>
+                <w:sz w:val="22"/>
+                <w:szCs w:val="22"/>
+              </w:rPr>
+              <w:t>, USA</w:t>
+            </w:r>
           </w:p>
         </w:tc>
       </w:tr>
@@ -3648,14 +3625,6 @@
                 <w:szCs w:val="22"/>
               </w:rPr>
             </w:pPr>
-            <w:r>
-              <w:rPr>
-                <w:rFonts w:ascii="Times New Roman" w:hAnsi="Times New Roman" w:cs="Times New Roman" w:hint="eastAsia"/>
-                <w:sz w:val="22"/>
-                <w:szCs w:val="22"/>
-              </w:rPr>
-              <w:t>2025</w:t>
-            </w:r>
           </w:p>
         </w:tc>
         <w:tc>
@@ -3666,97 +3635,12 @@
             <w:pPr>
               <w:rPr>
                 <w:rFonts w:ascii="Times New Roman" w:hAnsi="Times New Roman" w:cs="Times New Roman"/>
-                <w:sz w:val="22"/>
-                <w:szCs w:val="22"/>
-              </w:rPr>
-            </w:pPr>
-            <w:r>
-              <w:rPr>
-                <w:rFonts w:ascii="Times New Roman" w:hAnsi="Times New Roman" w:cs="Times New Roman" w:hint="eastAsia"/>
                 <w:b/>
                 <w:bCs/>
                 <w:sz w:val="22"/>
                 <w:szCs w:val="22"/>
               </w:rPr>
-              <w:t xml:space="preserve">Sohee Shin. </w:t>
-            </w:r>
-            <w:r>
-              <w:rPr>
-                <w:rFonts w:ascii="Times New Roman" w:hAnsi="Times New Roman" w:cs="Times New Roman"/>
-                <w:b/>
-                <w:bCs/>
-                <w:sz w:val="22"/>
-                <w:szCs w:val="22"/>
-              </w:rPr>
-              <w:t>“</w:t>
-            </w:r>
-            <w:r>
-              <w:rPr>
-                <w:rFonts w:ascii="Times New Roman" w:hAnsi="Times New Roman" w:cs="Times New Roman" w:hint="eastAsia"/>
-                <w:sz w:val="22"/>
-                <w:szCs w:val="22"/>
-              </w:rPr>
-              <w:t>Educational Assortative Mating and Life Satisfaction</w:t>
-            </w:r>
-            <w:r>
-              <w:rPr>
-                <w:rFonts w:ascii="Times New Roman" w:hAnsi="Times New Roman" w:cs="Times New Roman" w:hint="eastAsia"/>
-                <w:sz w:val="22"/>
-                <w:szCs w:val="22"/>
-              </w:rPr>
-              <w:t xml:space="preserve"> </w:t>
-            </w:r>
-            <w:r>
-              <w:rPr>
-                <w:rFonts w:ascii="Times New Roman" w:hAnsi="Times New Roman" w:cs="Times New Roman" w:hint="eastAsia"/>
-                <w:sz w:val="22"/>
-                <w:szCs w:val="22"/>
-              </w:rPr>
-              <w:t>among</w:t>
-            </w:r>
-            <w:r>
-              <w:rPr>
-                <w:rFonts w:ascii="Times New Roman" w:hAnsi="Times New Roman" w:cs="Times New Roman" w:hint="eastAsia"/>
-                <w:sz w:val="22"/>
-                <w:szCs w:val="22"/>
-              </w:rPr>
-              <w:t xml:space="preserve"> Cross-Border Marriage Migrants in South Korea</w:t>
-            </w:r>
-            <w:r>
-              <w:rPr>
-                <w:rFonts w:ascii="Times New Roman" w:hAnsi="Times New Roman" w:cs="Times New Roman"/>
-                <w:sz w:val="22"/>
-                <w:szCs w:val="22"/>
-              </w:rPr>
-              <w:t>”</w:t>
-            </w:r>
-            <w:r>
-              <w:rPr>
-                <w:rFonts w:ascii="Times New Roman" w:hAnsi="Times New Roman" w:cs="Times New Roman" w:hint="eastAsia"/>
-                <w:sz w:val="22"/>
-                <w:szCs w:val="22"/>
-              </w:rPr>
-              <w:t>, paper presented at the 2025 I-CSK (International Conference on the Sociology of Korea), September 2025 at Stanford University, USA</w:t>
-            </w:r>
-          </w:p>
-          <w:p>
-            <w:pPr>
-              <w:rPr>
-                <w:rFonts w:ascii="Times New Roman" w:hAnsi="Times New Roman" w:cs="Times New Roman"/>
-                <w:b/>
-                <w:bCs/>
-                <w:sz w:val="22"/>
-                <w:szCs w:val="22"/>
-              </w:rPr>
-            </w:pPr>
-            <w:r>
-              <w:rPr>
-                <w:rFonts w:ascii="Times New Roman" w:hAnsi="Times New Roman" w:cs="Times New Roman" w:hint="eastAsia"/>
-                <w:sz w:val="22"/>
-                <w:szCs w:val="22"/>
-              </w:rPr>
-              <w:t xml:space="preserve"> </w:t>
-            </w:r>
+            </w:pPr>
           </w:p>
         </w:tc>
       </w:tr>
@@ -3778,7 +3662,7 @@
             </w:pPr>
             <w:r>
               <w:rPr>
-                <w:rFonts w:ascii="Times New Roman" w:hAnsi="Times New Roman" w:cs="Times New Roman"/>
+                <w:rFonts w:ascii="Times New Roman" w:hAnsi="Times New Roman" w:cs="Times New Roman" w:hint="eastAsia"/>
                 <w:sz w:val="22"/>
                 <w:szCs w:val="22"/>
               </w:rPr>
@@ -3800,29 +3684,55 @@
             </w:pPr>
             <w:r>
               <w:rPr>
-                <w:rFonts w:ascii="Times New Roman" w:hAnsi="Times New Roman" w:cs="Times New Roman"/>
+                <w:rFonts w:ascii="Times New Roman" w:hAnsi="Times New Roman" w:cs="Times New Roman" w:hint="eastAsia"/>
                 <w:b/>
                 <w:bCs/>
                 <w:sz w:val="22"/>
                 <w:szCs w:val="22"/>
               </w:rPr>
-              <w:t>Sohee Shin</w:t>
-            </w:r>
-            <w:r>
-              <w:rPr>
-                <w:rFonts w:ascii="Times New Roman" w:hAnsi="Times New Roman" w:cs="Times New Roman"/>
-                <w:sz w:val="22"/>
-                <w:szCs w:val="22"/>
-              </w:rPr>
-              <w:t xml:space="preserve"> and Jorge Manuel Chia, “</w:t>
-            </w:r>
-            <w:r>
-              <w:rPr>
-                <w:rFonts w:ascii="Times New Roman" w:hAnsi="Times New Roman" w:cs="Times New Roman" w:hint="eastAsia"/>
-                <w:sz w:val="22"/>
-                <w:szCs w:val="22"/>
-              </w:rPr>
-              <w:t>Educational Pairing and Life Satisfaction: Among Cross-Border Marriage Migrants in South Korea</w:t>
+              <w:t xml:space="preserve">Sohee Shin. </w:t>
+            </w:r>
+            <w:r>
+              <w:rPr>
+                <w:rFonts w:ascii="Times New Roman" w:hAnsi="Times New Roman" w:cs="Times New Roman"/>
+                <w:b/>
+                <w:bCs/>
+                <w:sz w:val="22"/>
+                <w:szCs w:val="22"/>
+              </w:rPr>
+              <w:t>“</w:t>
+            </w:r>
+            <w:r>
+              <w:rPr>
+                <w:rFonts w:ascii="Times New Roman" w:hAnsi="Times New Roman" w:cs="Times New Roman" w:hint="eastAsia"/>
+                <w:sz w:val="22"/>
+                <w:szCs w:val="22"/>
+              </w:rPr>
+              <w:t>Educational Assortative Mating and Life Satisfaction</w:t>
+            </w:r>
+            <w:r>
+              <w:rPr>
+                <w:rFonts w:ascii="Times New Roman" w:hAnsi="Times New Roman" w:cs="Times New Roman" w:hint="eastAsia"/>
+                <w:sz w:val="22"/>
+                <w:szCs w:val="22"/>
+              </w:rPr>
+              <w:t xml:space="preserve"> </w:t>
+            </w:r>
+            <w:r>
+              <w:rPr>
+                <w:rFonts w:ascii="Times New Roman" w:hAnsi="Times New Roman" w:cs="Times New Roman" w:hint="eastAsia"/>
+                <w:sz w:val="22"/>
+                <w:szCs w:val="22"/>
+              </w:rPr>
+              <w:t>among</w:t>
+            </w:r>
+            <w:r>
+              <w:rPr>
+                <w:rFonts w:ascii="Times New Roman" w:hAnsi="Times New Roman" w:cs="Times New Roman" w:hint="eastAsia"/>
+                <w:sz w:val="22"/>
+                <w:szCs w:val="22"/>
+              </w:rPr>
+              <w:t xml:space="preserve"> Cross-Border Marriage Migrants in South Korea</w:t>
             </w:r>
             <w:r>
               <w:rPr>
@@ -3838,25 +3748,27 @@
                 <w:sz w:val="22"/>
                 <w:szCs w:val="22"/>
               </w:rPr>
-              <w:t xml:space="preserve">, </w:t>
-            </w:r>
-            <w:r>
-              <w:rPr>
-                <w:rFonts w:ascii="Times New Roman" w:hAnsi="Times New Roman" w:cs="Times New Roman"/>
-                <w:sz w:val="22"/>
-                <w:szCs w:val="22"/>
-              </w:rPr>
-              <w:t>paper presented at the 2025 American Sociological Association (regular session), August 2025 in Chicago, USA</w:t>
-            </w:r>
-          </w:p>
-          <w:p>
-            <w:pPr>
-              <w:rPr>
-                <w:rFonts w:ascii="Times New Roman" w:hAnsi="Times New Roman" w:cs="Times New Roman"/>
-                <w:sz w:val="22"/>
-                <w:szCs w:val="22"/>
-              </w:rPr>
-            </w:pPr>
+              <w:t>, paper presented at the 2025 I-CSK (International Conference on the Sociology of Korea), September 2025 at Stanford University, USA</w:t>
+            </w:r>
+          </w:p>
+          <w:p>
+            <w:pPr>
+              <w:rPr>
+                <w:rFonts w:ascii="Times New Roman" w:hAnsi="Times New Roman" w:cs="Times New Roman"/>
+                <w:b/>
+                <w:bCs/>
+                <w:sz w:val="22"/>
+                <w:szCs w:val="22"/>
+              </w:rPr>
+            </w:pPr>
+            <w:r>
+              <w:rPr>
+                <w:rFonts w:ascii="Times New Roman" w:hAnsi="Times New Roman" w:cs="Times New Roman" w:hint="eastAsia"/>
+                <w:sz w:val="22"/>
+                <w:szCs w:val="22"/>
+              </w:rPr>
+              <w:t xml:space="preserve"> </w:t>
+            </w:r>
           </w:p>
         </w:tc>
       </w:tr>
@@ -3906,61 +3818,53 @@
                 <w:sz w:val="22"/>
                 <w:szCs w:val="22"/>
               </w:rPr>
-              <w:t xml:space="preserve">Sohee Shin, </w:t>
-            </w:r>
-            <w:r>
-              <w:rPr>
-                <w:rFonts w:ascii="Times New Roman" w:hAnsi="Times New Roman" w:cs="Times New Roman"/>
-                <w:sz w:val="22"/>
-                <w:szCs w:val="22"/>
-              </w:rPr>
-              <w:t xml:space="preserve">“Spousal Education Gaps and Life Satisfaction in Cross-Border Marriages: Urban-Rural differences in South Korea”, paper presented at </w:t>
-            </w:r>
-            <w:r>
-              <w:rPr>
-                <w:rFonts w:ascii="Times New Roman" w:hAnsi="Times New Roman" w:cs="Times New Roman"/>
-                <w:i/>
-                <w:iCs/>
-                <w:sz w:val="22"/>
-                <w:szCs w:val="22"/>
-              </w:rPr>
-              <w:t>the 2025 Population Association of America (po</w:t>
-            </w:r>
-            <w:r>
-              <w:rPr>
-                <w:rFonts w:ascii="Times New Roman" w:hAnsi="Times New Roman" w:cs="Times New Roman" w:hint="eastAsia"/>
-                <w:i/>
-                <w:iCs/>
-                <w:sz w:val="22"/>
-                <w:szCs w:val="22"/>
-              </w:rPr>
-              <w:t>st</w:t>
-            </w:r>
-            <w:r>
-              <w:rPr>
-                <w:rFonts w:ascii="Times New Roman" w:hAnsi="Times New Roman" w:cs="Times New Roman"/>
-                <w:i/>
-                <w:iCs/>
-                <w:sz w:val="22"/>
-                <w:szCs w:val="22"/>
-              </w:rPr>
-              <w:t>er session)</w:t>
-            </w:r>
-            <w:r>
-              <w:rPr>
-                <w:rFonts w:ascii="Times New Roman" w:hAnsi="Times New Roman" w:cs="Times New Roman"/>
-                <w:sz w:val="22"/>
-                <w:szCs w:val="22"/>
-              </w:rPr>
-              <w:t>, April 2025 in Washington DC, USA</w:t>
-            </w:r>
-          </w:p>
-          <w:p>
-            <w:pPr>
-              <w:rPr>
-                <w:rFonts w:ascii="Times New Roman" w:hAnsi="Times New Roman" w:cs="Times New Roman"/>
-                <w:b/>
-                <w:bCs/>
+              <w:t>Sohee Shin</w:t>
+            </w:r>
+            <w:r>
+              <w:rPr>
+                <w:rFonts w:ascii="Times New Roman" w:hAnsi="Times New Roman" w:cs="Times New Roman"/>
+                <w:sz w:val="22"/>
+                <w:szCs w:val="22"/>
+              </w:rPr>
+              <w:t xml:space="preserve"> and Jorge Manuel Chia, “</w:t>
+            </w:r>
+            <w:r>
+              <w:rPr>
+                <w:rFonts w:ascii="Times New Roman" w:hAnsi="Times New Roman" w:cs="Times New Roman" w:hint="eastAsia"/>
+                <w:sz w:val="22"/>
+                <w:szCs w:val="22"/>
+              </w:rPr>
+              <w:t>Educational Pairing and Life Satisfaction: Among Cross-Border Marriage Migrants in South Korea</w:t>
+            </w:r>
+            <w:r>
+              <w:rPr>
+                <w:rFonts w:ascii="Times New Roman" w:hAnsi="Times New Roman" w:cs="Times New Roman"/>
+                <w:sz w:val="22"/>
+                <w:szCs w:val="22"/>
+              </w:rPr>
+              <w:t>”</w:t>
+            </w:r>
+            <w:r>
+              <w:rPr>
+                <w:rFonts w:ascii="Times New Roman" w:hAnsi="Times New Roman" w:cs="Times New Roman" w:hint="eastAsia"/>
+                <w:sz w:val="22"/>
+                <w:szCs w:val="22"/>
+              </w:rPr>
+              <w:t xml:space="preserve">, </w:t>
+            </w:r>
+            <w:r>
+              <w:rPr>
+                <w:rFonts w:ascii="Times New Roman" w:hAnsi="Times New Roman" w:cs="Times New Roman"/>
+                <w:sz w:val="22"/>
+                <w:szCs w:val="22"/>
+              </w:rPr>
+              <w:t>paper presented at the 2025 American Sociological Association (regular session), August 2025 in Chicago, USA</w:t>
+            </w:r>
+          </w:p>
+          <w:p>
+            <w:pPr>
+              <w:rPr>
+                <w:rFonts w:ascii="Times New Roman" w:hAnsi="Times New Roman" w:cs="Times New Roman"/>
                 <w:sz w:val="22"/>
                 <w:szCs w:val="22"/>
               </w:rPr>
@@ -3986,11 +3890,11 @@
             </w:pPr>
             <w:r>
               <w:rPr>
-                <w:rFonts w:ascii="Times New Roman" w:hAnsi="Times New Roman" w:cs="Times New Roman" w:hint="eastAsia"/>
-                <w:sz w:val="22"/>
-                <w:szCs w:val="22"/>
-              </w:rPr>
-              <w:t>2024</w:t>
+                <w:rFonts w:ascii="Times New Roman" w:hAnsi="Times New Roman" w:cs="Times New Roman"/>
+                <w:sz w:val="22"/>
+                <w:szCs w:val="22"/>
+              </w:rPr>
+              <w:t>2025</w:t>
             </w:r>
           </w:p>
         </w:tc>
@@ -4008,87 +3912,67 @@
             </w:pPr>
             <w:r>
               <w:rPr>
-                <w:rFonts w:ascii="Times New Roman" w:hAnsi="Times New Roman" w:cs="Times New Roman" w:hint="eastAsia"/>
+                <w:rFonts w:ascii="Times New Roman" w:hAnsi="Times New Roman" w:cs="Times New Roman"/>
                 <w:b/>
                 <w:bCs/>
                 <w:sz w:val="22"/>
                 <w:szCs w:val="22"/>
               </w:rPr>
-              <w:t>Sohee Shin</w:t>
-            </w:r>
-            <w:r>
-              <w:rPr>
-                <w:rFonts w:ascii="Times New Roman" w:hAnsi="Times New Roman" w:cs="Times New Roman" w:hint="eastAsia"/>
-                <w:sz w:val="22"/>
-                <w:szCs w:val="22"/>
-              </w:rPr>
-              <w:t xml:space="preserve">, </w:t>
-            </w:r>
-            <w:r>
-              <w:rPr>
-                <w:rFonts w:ascii="Times New Roman" w:hAnsi="Times New Roman" w:cs="Times New Roman"/>
-                <w:sz w:val="22"/>
-                <w:szCs w:val="22"/>
-              </w:rPr>
-              <w:t>“</w:t>
-            </w:r>
-            <w:r>
-              <w:rPr>
-                <w:rFonts w:ascii="Times New Roman" w:hAnsi="Times New Roman" w:cs="Times New Roman" w:hint="eastAsia"/>
-                <w:sz w:val="22"/>
-                <w:szCs w:val="22"/>
-              </w:rPr>
-              <w:t>Persistent Unemployment and Hypertension Risks in the United States: Case-Crossover Study</w:t>
-            </w:r>
-            <w:r>
-              <w:rPr>
-                <w:rFonts w:ascii="Times New Roman" w:hAnsi="Times New Roman" w:cs="Times New Roman"/>
-                <w:sz w:val="22"/>
-                <w:szCs w:val="22"/>
-              </w:rPr>
-              <w:t>”</w:t>
-            </w:r>
-            <w:r>
-              <w:rPr>
-                <w:rFonts w:ascii="Times New Roman" w:hAnsi="Times New Roman" w:cs="Times New Roman" w:hint="eastAsia"/>
-                <w:sz w:val="22"/>
-                <w:szCs w:val="22"/>
-              </w:rPr>
-              <w:t xml:space="preserve">, paper presented at </w:t>
-            </w:r>
-            <w:r>
-              <w:rPr>
-                <w:rFonts w:ascii="Times New Roman" w:hAnsi="Times New Roman" w:cs="Times New Roman" w:hint="eastAsia"/>
+              <w:t xml:space="preserve">Sohee Shin, </w:t>
+            </w:r>
+            <w:r>
+              <w:rPr>
+                <w:rFonts w:ascii="Times New Roman" w:hAnsi="Times New Roman" w:cs="Times New Roman"/>
+                <w:sz w:val="22"/>
+                <w:szCs w:val="22"/>
+              </w:rPr>
+              <w:t xml:space="preserve">“Spousal Education Gaps and Life Satisfaction in Cross-Border Marriages: Urban-Rural differences in South Korea”, paper presented at </w:t>
+            </w:r>
+            <w:r>
+              <w:rPr>
+                <w:rFonts w:ascii="Times New Roman" w:hAnsi="Times New Roman" w:cs="Times New Roman"/>
                 <w:i/>
                 <w:iCs/>
                 <w:sz w:val="22"/>
                 <w:szCs w:val="22"/>
               </w:rPr>
-              <w:t>the 2024 Population Association of America</w:t>
-            </w:r>
-            <w:r>
-              <w:rPr>
-                <w:rFonts w:ascii="Times New Roman" w:hAnsi="Times New Roman" w:cs="Times New Roman"/>
+              <w:t>the 2025 Population Association of America (po</w:t>
+            </w:r>
+            <w:r>
+              <w:rPr>
+                <w:rFonts w:ascii="Times New Roman" w:hAnsi="Times New Roman" w:cs="Times New Roman" w:hint="eastAsia"/>
                 <w:i/>
                 <w:iCs/>
                 <w:sz w:val="22"/>
                 <w:szCs w:val="22"/>
               </w:rPr>
-              <w:t xml:space="preserve"> (poster session)</w:t>
-            </w:r>
-            <w:r>
-              <w:rPr>
-                <w:rFonts w:ascii="Times New Roman" w:hAnsi="Times New Roman" w:cs="Times New Roman" w:hint="eastAsia"/>
-                <w:sz w:val="22"/>
-                <w:szCs w:val="22"/>
-              </w:rPr>
-              <w:t xml:space="preserve">, April 2024 in Columbus, Ohio, USA. </w:t>
-            </w:r>
-          </w:p>
-          <w:p>
-            <w:pPr>
-              <w:rPr>
-                <w:rFonts w:ascii="Times New Roman" w:hAnsi="Times New Roman" w:cs="Times New Roman"/>
+              <w:t>st</w:t>
+            </w:r>
+            <w:r>
+              <w:rPr>
+                <w:rFonts w:ascii="Times New Roman" w:hAnsi="Times New Roman" w:cs="Times New Roman"/>
+                <w:i/>
+                <w:iCs/>
+                <w:sz w:val="22"/>
+                <w:szCs w:val="22"/>
+              </w:rPr>
+              <w:t>er session)</w:t>
+            </w:r>
+            <w:r>
+              <w:rPr>
+                <w:rFonts w:ascii="Times New Roman" w:hAnsi="Times New Roman" w:cs="Times New Roman"/>
+                <w:sz w:val="22"/>
+                <w:szCs w:val="22"/>
+              </w:rPr>
+              <w:t>, April 2025 in Washington DC, USA</w:t>
+            </w:r>
+          </w:p>
+          <w:p>
+            <w:pPr>
+              <w:rPr>
+                <w:rFonts w:ascii="Times New Roman" w:hAnsi="Times New Roman" w:cs="Times New Roman"/>
+                <w:b/>
+                <w:bCs/>
                 <w:sz w:val="22"/>
                 <w:szCs w:val="22"/>
               </w:rPr>
@@ -4118,15 +4002,8 @@
                 <w:sz w:val="22"/>
                 <w:szCs w:val="22"/>
               </w:rPr>
-              <w:t>202</w:t>
-            </w:r>
-            <w:r>
-              <w:rPr>
-                <w:rFonts w:ascii="Times New Roman" w:hAnsi="Times New Roman" w:cs="Times New Roman"/>
-                <w:sz w:val="22"/>
-                <w:szCs w:val="22"/>
-              </w:rPr>
-              <w:t>4</w:t>
+              <w:lastRenderedPageBreak/>
+              <w:t>2024</w:t>
             </w:r>
           </w:p>
         </w:tc>
@@ -4150,13 +4027,19 @@
                 <w:sz w:val="22"/>
                 <w:szCs w:val="22"/>
               </w:rPr>
-              <w:t xml:space="preserve">Sohee Shin, </w:t>
-            </w:r>
-            <w:r>
-              <w:rPr>
-                <w:rFonts w:ascii="Times New Roman" w:hAnsi="Times New Roman" w:cs="Times New Roman"/>
-                <w:b/>
-                <w:bCs/>
+              <w:t>Sohee Shin</w:t>
+            </w:r>
+            <w:r>
+              <w:rPr>
+                <w:rFonts w:ascii="Times New Roman" w:hAnsi="Times New Roman" w:cs="Times New Roman" w:hint="eastAsia"/>
+                <w:sz w:val="22"/>
+                <w:szCs w:val="22"/>
+              </w:rPr>
+              <w:t xml:space="preserve">, </w:t>
+            </w:r>
+            <w:r>
+              <w:rPr>
+                <w:rFonts w:ascii="Times New Roman" w:hAnsi="Times New Roman" w:cs="Times New Roman"/>
                 <w:sz w:val="22"/>
                 <w:szCs w:val="22"/>
               </w:rPr>
@@ -4168,23 +4051,7 @@
                 <w:sz w:val="22"/>
                 <w:szCs w:val="22"/>
               </w:rPr>
-              <w:t xml:space="preserve">Unemployment Status and Health Risks in the United States: Exploring </w:t>
-            </w:r>
-            <w:r>
-              <w:rPr>
-                <w:rFonts w:ascii="Times New Roman" w:hAnsi="Times New Roman" w:cs="Times New Roman"/>
-                <w:sz w:val="22"/>
-                <w:szCs w:val="22"/>
-              </w:rPr>
-              <w:t>Nativity</w:t>
-            </w:r>
-            <w:r>
-              <w:rPr>
-                <w:rFonts w:ascii="Times New Roman" w:hAnsi="Times New Roman" w:cs="Times New Roman" w:hint="eastAsia"/>
-                <w:sz w:val="22"/>
-                <w:szCs w:val="22"/>
-              </w:rPr>
-              <w:t>, Unemployment Patterns and Health</w:t>
+              <w:t>Persistent Unemployment and Hypertension Risks in the United States: Case-Crossover Study</w:t>
             </w:r>
             <w:r>
               <w:rPr>
@@ -4210,60 +4077,25 @@
                 <w:sz w:val="22"/>
                 <w:szCs w:val="22"/>
               </w:rPr>
-              <w:t xml:space="preserve">the </w:t>
-            </w:r>
-            <w:r>
-              <w:rPr>
-                <w:rFonts w:ascii="Times New Roman" w:hAnsi="Times New Roman" w:cs="Times New Roman" w:hint="eastAsia"/>
+              <w:t>the 2024 Population Association of America</w:t>
+            </w:r>
+            <w:r>
+              <w:rPr>
+                <w:rFonts w:ascii="Times New Roman" w:hAnsi="Times New Roman" w:cs="Times New Roman"/>
                 <w:i/>
                 <w:iCs/>
                 <w:sz w:val="22"/>
                 <w:szCs w:val="22"/>
               </w:rPr>
-              <w:lastRenderedPageBreak/>
-              <w:t>2023 Graduate Student Colloquium: Turbulent Times</w:t>
-            </w:r>
-            <w:r>
-              <w:rPr>
-                <w:rFonts w:ascii="Times New Roman" w:hAnsi="Times New Roman" w:cs="Times New Roman" w:hint="eastAsia"/>
-                <w:sz w:val="22"/>
-                <w:szCs w:val="22"/>
-              </w:rPr>
-              <w:t>, March 202</w:t>
-            </w:r>
-            <w:r>
-              <w:rPr>
-                <w:rFonts w:ascii="Times New Roman" w:hAnsi="Times New Roman" w:cs="Times New Roman"/>
-                <w:sz w:val="22"/>
-                <w:szCs w:val="22"/>
-              </w:rPr>
-              <w:t>4</w:t>
-            </w:r>
-            <w:r>
-              <w:rPr>
-                <w:rFonts w:ascii="Times New Roman" w:hAnsi="Times New Roman" w:cs="Times New Roman" w:hint="eastAsia"/>
-                <w:sz w:val="22"/>
-                <w:szCs w:val="22"/>
-              </w:rPr>
-              <w:t xml:space="preserve">. State University of New York </w:t>
-            </w:r>
-            <w:proofErr w:type="gramStart"/>
-            <w:r>
-              <w:rPr>
-                <w:rFonts w:ascii="Times New Roman" w:hAnsi="Times New Roman" w:cs="Times New Roman" w:hint="eastAsia"/>
-                <w:sz w:val="22"/>
-                <w:szCs w:val="22"/>
-              </w:rPr>
-              <w:t>at</w:t>
-            </w:r>
-            <w:proofErr w:type="gramEnd"/>
-            <w:r>
-              <w:rPr>
-                <w:rFonts w:ascii="Times New Roman" w:hAnsi="Times New Roman" w:cs="Times New Roman" w:hint="eastAsia"/>
-                <w:sz w:val="22"/>
-                <w:szCs w:val="22"/>
-              </w:rPr>
-              <w:t xml:space="preserve"> Stony Brook.</w:t>
+              <w:t xml:space="preserve"> (poster session)</w:t>
+            </w:r>
+            <w:r>
+              <w:rPr>
+                <w:rFonts w:ascii="Times New Roman" w:hAnsi="Times New Roman" w:cs="Times New Roman" w:hint="eastAsia"/>
+                <w:sz w:val="22"/>
+                <w:szCs w:val="22"/>
+              </w:rPr>
+              <w:t xml:space="preserve">, April 2024 in Columbus, Ohio, USA. </w:t>
             </w:r>
           </w:p>
           <w:p>
@@ -4299,7 +4131,158 @@
                 <w:sz w:val="22"/>
                 <w:szCs w:val="22"/>
               </w:rPr>
-              <w:lastRenderedPageBreak/>
+              <w:t>202</w:t>
+            </w:r>
+            <w:r>
+              <w:rPr>
+                <w:rFonts w:ascii="Times New Roman" w:hAnsi="Times New Roman" w:cs="Times New Roman"/>
+                <w:sz w:val="22"/>
+                <w:szCs w:val="22"/>
+              </w:rPr>
+              <w:t>4</w:t>
+            </w:r>
+          </w:p>
+        </w:tc>
+        <w:tc>
+          <w:tcPr>
+            <w:tcW w:w="7567" w:type="dxa"/>
+          </w:tcPr>
+          <w:p>
+            <w:pPr>
+              <w:rPr>
+                <w:rFonts w:ascii="Times New Roman" w:hAnsi="Times New Roman" w:cs="Times New Roman"/>
+                <w:sz w:val="22"/>
+                <w:szCs w:val="22"/>
+              </w:rPr>
+            </w:pPr>
+            <w:r>
+              <w:rPr>
+                <w:rFonts w:ascii="Times New Roman" w:hAnsi="Times New Roman" w:cs="Times New Roman" w:hint="eastAsia"/>
+                <w:b/>
+                <w:bCs/>
+                <w:sz w:val="22"/>
+                <w:szCs w:val="22"/>
+              </w:rPr>
+              <w:t xml:space="preserve">Sohee Shin, </w:t>
+            </w:r>
+            <w:r>
+              <w:rPr>
+                <w:rFonts w:ascii="Times New Roman" w:hAnsi="Times New Roman" w:cs="Times New Roman"/>
+                <w:b/>
+                <w:bCs/>
+                <w:sz w:val="22"/>
+                <w:szCs w:val="22"/>
+              </w:rPr>
+              <w:t>“</w:t>
+            </w:r>
+            <w:r>
+              <w:rPr>
+                <w:rFonts w:ascii="Times New Roman" w:hAnsi="Times New Roman" w:cs="Times New Roman" w:hint="eastAsia"/>
+                <w:sz w:val="22"/>
+                <w:szCs w:val="22"/>
+              </w:rPr>
+              <w:t xml:space="preserve">Unemployment Status and Health Risks in the United States: Exploring </w:t>
+            </w:r>
+            <w:r>
+              <w:rPr>
+                <w:rFonts w:ascii="Times New Roman" w:hAnsi="Times New Roman" w:cs="Times New Roman"/>
+                <w:sz w:val="22"/>
+                <w:szCs w:val="22"/>
+              </w:rPr>
+              <w:t>Nativity</w:t>
+            </w:r>
+            <w:r>
+              <w:rPr>
+                <w:rFonts w:ascii="Times New Roman" w:hAnsi="Times New Roman" w:cs="Times New Roman" w:hint="eastAsia"/>
+                <w:sz w:val="22"/>
+                <w:szCs w:val="22"/>
+              </w:rPr>
+              <w:t>, Unemployment Patterns and Health</w:t>
+            </w:r>
+            <w:r>
+              <w:rPr>
+                <w:rFonts w:ascii="Times New Roman" w:hAnsi="Times New Roman" w:cs="Times New Roman"/>
+                <w:sz w:val="22"/>
+                <w:szCs w:val="22"/>
+              </w:rPr>
+              <w:t>”</w:t>
+            </w:r>
+            <w:r>
+              <w:rPr>
+                <w:rFonts w:ascii="Times New Roman" w:hAnsi="Times New Roman" w:cs="Times New Roman" w:hint="eastAsia"/>
+                <w:sz w:val="22"/>
+                <w:szCs w:val="22"/>
+              </w:rPr>
+              <w:t xml:space="preserve">, paper presented at </w:t>
+            </w:r>
+            <w:r>
+              <w:rPr>
+                <w:rFonts w:ascii="Times New Roman" w:hAnsi="Times New Roman" w:cs="Times New Roman" w:hint="eastAsia"/>
+                <w:i/>
+                <w:iCs/>
+                <w:sz w:val="22"/>
+                <w:szCs w:val="22"/>
+              </w:rPr>
+              <w:t>the 2023 Graduate Student Colloquium: Turbulent Times</w:t>
+            </w:r>
+            <w:r>
+              <w:rPr>
+                <w:rFonts w:ascii="Times New Roman" w:hAnsi="Times New Roman" w:cs="Times New Roman" w:hint="eastAsia"/>
+                <w:sz w:val="22"/>
+                <w:szCs w:val="22"/>
+              </w:rPr>
+              <w:t>, March 202</w:t>
+            </w:r>
+            <w:r>
+              <w:rPr>
+                <w:rFonts w:ascii="Times New Roman" w:hAnsi="Times New Roman" w:cs="Times New Roman"/>
+                <w:sz w:val="22"/>
+                <w:szCs w:val="22"/>
+              </w:rPr>
+              <w:t>4</w:t>
+            </w:r>
+            <w:r>
+              <w:rPr>
+                <w:rFonts w:ascii="Times New Roman" w:hAnsi="Times New Roman" w:cs="Times New Roman" w:hint="eastAsia"/>
+                <w:sz w:val="22"/>
+                <w:szCs w:val="22"/>
+              </w:rPr>
+              <w:t>. State University of New York at Stony Brook.</w:t>
+            </w:r>
+          </w:p>
+          <w:p>
+            <w:pPr>
+              <w:rPr>
+                <w:rFonts w:ascii="Times New Roman" w:hAnsi="Times New Roman" w:cs="Times New Roman"/>
+                <w:sz w:val="22"/>
+                <w:szCs w:val="22"/>
+              </w:rPr>
+            </w:pPr>
+          </w:p>
+        </w:tc>
+      </w:tr>
+      <w:tr>
+        <w:trPr>
+          <w:trHeight w:val="279"/>
+        </w:trPr>
+        <w:tc>
+          <w:tcPr>
+            <w:tcW w:w="1687" w:type="dxa"/>
+          </w:tcPr>
+          <w:p>
+            <w:pPr>
+              <w:rPr>
+                <w:rFonts w:ascii="Times New Roman" w:hAnsi="Times New Roman" w:cs="Times New Roman"/>
+                <w:sz w:val="22"/>
+                <w:szCs w:val="22"/>
+              </w:rPr>
+            </w:pPr>
+            <w:r>
+              <w:rPr>
+                <w:rFonts w:ascii="Times New Roman" w:hAnsi="Times New Roman" w:cs="Times New Roman" w:hint="eastAsia"/>
+                <w:sz w:val="22"/>
+                <w:szCs w:val="22"/>
+              </w:rPr>
               <w:t>2023</w:t>
             </w:r>
           </w:p>
@@ -5493,7 +5476,16 @@
                 <w:sz w:val="22"/>
                 <w:szCs w:val="22"/>
               </w:rPr>
-              <w:t>, the Center for Innovation in Teaching &amp; Learning</w:t>
+              <w:t xml:space="preserve">, the </w:t>
+            </w:r>
+            <w:r>
+              <w:rPr>
+                <w:rFonts w:ascii="Times New Roman" w:hAnsi="Times New Roman" w:cs="Times New Roman" w:hint="eastAsia"/>
+                <w:sz w:val="22"/>
+                <w:szCs w:val="22"/>
+              </w:rPr>
+              <w:lastRenderedPageBreak/>
+              <w:t>Center for Innovation in Teaching &amp; Learning</w:t>
             </w:r>
           </w:p>
           <w:p>
@@ -5533,6 +5525,7 @@
                 <w:sz w:val="22"/>
                 <w:szCs w:val="22"/>
               </w:rPr>
+              <w:lastRenderedPageBreak/>
               <w:t>*Taught three semesters</w:t>
             </w:r>
           </w:p>
@@ -5550,6 +5543,7 @@
                 <w:sz w:val="22"/>
                 <w:szCs w:val="22"/>
               </w:rPr>
+              <w:lastRenderedPageBreak/>
               <w:t>*</w:t>
             </w:r>
             <w:r>
@@ -5599,6 +5593,7 @@
                 <w:sz w:val="22"/>
                 <w:szCs w:val="22"/>
               </w:rPr>
+              <w:lastRenderedPageBreak/>
               <w:t>2026</w:t>
             </w:r>
             <w:r>
@@ -6956,6 +6951,7 @@
                 <w:sz w:val="22"/>
                 <w:szCs w:val="22"/>
               </w:rPr>
+              <w:lastRenderedPageBreak/>
               <w:t>2025-2026</w:t>
             </w:r>
           </w:p>
@@ -7122,7 +7118,6 @@
                 <w:sz w:val="22"/>
                 <w:szCs w:val="22"/>
               </w:rPr>
-              <w:lastRenderedPageBreak/>
               <w:t>2023</w:t>
             </w:r>
           </w:p>

</xml_diff>